<commit_message>
Add DB BR 440
</commit_message>
<xml_diff>
--- a/raildriver-Germany-Remapped.docx
+++ b/raildriver-Germany-Remapped.docx
@@ -48182,6 +48182,1287 @@
                 <w:szCs w:val="16"/>
               </w:rPr>
               <w:t>Parking Brake Off</w:t>
+            </w:r>
+          </w:p>
+        </w:tc>
+        <w:tc>
+          <w:tcPr>
+            <w:tcW w:w="1016" w:type="dxa"/>
+            <w:tcBorders>
+              <w:top w:val="single" w:sz="4" w:space="0" w:color="000000"/>
+              <w:left w:val="single" w:sz="4" w:space="0" w:color="000000"/>
+              <w:bottom w:val="single" w:sz="4" w:space="0" w:color="000000"/>
+            </w:tcBorders>
+            <w:vAlign w:val="bottom"/>
+          </w:tcPr>
+          <w:p>
+            <w:pPr>
+              <w:pStyle w:val="Normal"/>
+              <w:widowControl w:val="false"/>
+              <w:spacing w:lineRule="auto" w:line="180"/>
+              <w:jc w:val="center"/>
+              <w:rPr>
+                <w:color w:val="000000"/>
+                <w:sz w:val="16"/>
+                <w:szCs w:val="16"/>
+              </w:rPr>
+            </w:pPr>
+            <w:r>
+              <w:rPr>
+                <w:rFonts w:eastAsia="arial" w:ascii="arial" w:hAnsi="arial"/>
+                <w:color w:val="000000"/>
+                <w:sz w:val="16"/>
+                <w:szCs w:val="16"/>
+              </w:rPr>
+              <w:t>Exterior</w:t>
+            </w:r>
+          </w:p>
+          <w:p>
+            <w:pPr>
+              <w:pStyle w:val="Normal"/>
+              <w:widowControl w:val="false"/>
+              <w:spacing w:lineRule="auto" w:line="180"/>
+              <w:jc w:val="center"/>
+              <w:rPr>
+                <w:color w:val="000000"/>
+                <w:sz w:val="16"/>
+                <w:szCs w:val="16"/>
+              </w:rPr>
+            </w:pPr>
+            <w:r>
+              <w:rPr>
+                <w:rFonts w:eastAsia="arial" w:ascii="arial" w:hAnsi="arial"/>
+                <w:color w:val="000000"/>
+                <w:sz w:val="16"/>
+                <w:szCs w:val="16"/>
+              </w:rPr>
+              <w:t>Camera</w:t>
+            </w:r>
+          </w:p>
+        </w:tc>
+        <w:tc>
+          <w:tcPr>
+            <w:tcW w:w="1029" w:type="dxa"/>
+            <w:tcBorders>
+              <w:top w:val="single" w:sz="4" w:space="0" w:color="000000"/>
+              <w:left w:val="single" w:sz="4" w:space="0" w:color="000000"/>
+              <w:bottom w:val="single" w:sz="4" w:space="0" w:color="000000"/>
+              <w:right w:val="single" w:sz="4" w:space="0" w:color="000000"/>
+            </w:tcBorders>
+            <w:vAlign w:val="bottom"/>
+          </w:tcPr>
+          <w:p>
+            <w:pPr>
+              <w:pStyle w:val="Normal"/>
+              <w:widowControl w:val="false"/>
+              <w:spacing w:lineRule="auto" w:line="180"/>
+              <w:jc w:val="center"/>
+              <w:rPr>
+                <w:color w:val="000000"/>
+                <w:sz w:val="16"/>
+                <w:szCs w:val="16"/>
+              </w:rPr>
+            </w:pPr>
+            <w:r>
+              <w:rPr>
+                <w:rFonts w:eastAsia="arial" w:ascii="arial" w:hAnsi="arial"/>
+                <w:color w:val="000000"/>
+                <w:sz w:val="16"/>
+                <w:szCs w:val="16"/>
+              </w:rPr>
+              <w:t>Prev</w:t>
+            </w:r>
+          </w:p>
+          <w:p>
+            <w:pPr>
+              <w:pStyle w:val="Normal"/>
+              <w:widowControl w:val="false"/>
+              <w:spacing w:lineRule="auto" w:line="180"/>
+              <w:jc w:val="center"/>
+              <w:rPr>
+                <w:color w:val="000000"/>
+                <w:sz w:val="16"/>
+                <w:szCs w:val="16"/>
+              </w:rPr>
+            </w:pPr>
+            <w:r>
+              <w:rPr>
+                <w:rFonts w:eastAsia="arial" w:ascii="arial" w:hAnsi="arial"/>
+                <w:color w:val="000000"/>
+                <w:sz w:val="16"/>
+                <w:szCs w:val="16"/>
+              </w:rPr>
+              <w:t>Cab Cam</w:t>
+            </w:r>
+          </w:p>
+        </w:tc>
+      </w:tr>
+    </w:tbl>
+    <w:p>
+      <w:pPr>
+        <w:pStyle w:val="Normal"/>
+        <w:bidi w:val="0"/>
+        <w:rPr>
+          <w:color w:val="000000"/>
+          <w:sz w:val="16"/>
+          <w:szCs w:val="16"/>
+        </w:rPr>
+      </w:pPr>
+      <w:r>
+        <w:rPr>
+          <w:color w:val="000000"/>
+          <w:sz w:val="16"/>
+          <w:szCs w:val="16"/>
+        </w:rPr>
+      </w:r>
+    </w:p>
+    <w:p>
+      <w:pPr>
+        <w:pStyle w:val="Normal"/>
+        <w:rPr>
+          <w:color w:val="000000"/>
+          <w:sz w:val="16"/>
+          <w:szCs w:val="16"/>
+        </w:rPr>
+      </w:pPr>
+      <w:r>
+        <w:rPr>
+          <w:color w:val="000000"/>
+          <w:sz w:val="16"/>
+          <w:szCs w:val="16"/>
+        </w:rPr>
+        <w:tab/>
+        <w:t xml:space="preserve">       </w:t>
+      </w:r>
+      <w:r>
+        <w:rPr>
+          <w:rFonts w:eastAsia="arial" w:ascii="arial" w:hAnsi="arial"/>
+          <w:color w:val="000000"/>
+          <w:sz w:val="16"/>
+          <w:szCs w:val="16"/>
+        </w:rPr>
+        <w:t xml:space="preserve">    DB BR 44</w:t>
+      </w:r>
+      <w:r>
+        <w:rPr>
+          <w:rFonts w:eastAsia="arial" w:ascii="arial" w:hAnsi="arial"/>
+          <w:color w:val="000000"/>
+          <w:sz w:val="16"/>
+          <w:szCs w:val="16"/>
+        </w:rPr>
+        <w:t>0</w:t>
+      </w:r>
+      <w:r>
+        <w:rPr>
+          <w:rFonts w:eastAsia="arial" w:ascii="arial" w:hAnsi="arial"/>
+          <w:color w:val="000000"/>
+          <w:sz w:val="16"/>
+          <w:szCs w:val="16"/>
+        </w:rPr>
+        <w:t>-1</w:t>
+      </w:r>
+    </w:p>
+    <w:tbl>
+      <w:tblPr>
+        <w:tblW w:w="14248" w:type="dxa"/>
+        <w:jc w:val="left"/>
+        <w:tblInd w:w="-5" w:type="dxa"/>
+        <w:tblLayout w:type="fixed"/>
+        <w:tblCellMar>
+          <w:top w:w="0" w:type="dxa"/>
+          <w:left w:w="108" w:type="dxa"/>
+          <w:bottom w:w="0" w:type="dxa"/>
+          <w:right w:w="108" w:type="dxa"/>
+        </w:tblCellMar>
+        <w:tblLook w:firstRow="1" w:noVBand="1" w:lastRow="0" w:firstColumn="1" w:lastColumn="0" w:noHBand="0" w:val="04a0"/>
+      </w:tblPr>
+      <w:tblGrid>
+        <w:gridCol w:w="1017"/>
+        <w:gridCol w:w="1019"/>
+        <w:gridCol w:w="1014"/>
+        <w:gridCol w:w="1016"/>
+        <w:gridCol w:w="1020"/>
+        <w:gridCol w:w="1016"/>
+        <w:gridCol w:w="1016"/>
+        <w:gridCol w:w="1017"/>
+        <w:gridCol w:w="1016"/>
+        <w:gridCol w:w="1020"/>
+        <w:gridCol w:w="1016"/>
+        <w:gridCol w:w="1016"/>
+        <w:gridCol w:w="1016"/>
+        <w:gridCol w:w="1029"/>
+      </w:tblGrid>
+      <w:tr>
+        <w:trPr>
+          <w:trHeight w:val="440" w:hRule="exact"/>
+          <w:cantSplit w:val="true"/>
+        </w:trPr>
+        <w:tc>
+          <w:tcPr>
+            <w:tcW w:w="1017" w:type="dxa"/>
+            <w:tcBorders>
+              <w:top w:val="single" w:sz="4" w:space="0" w:color="000000"/>
+              <w:left w:val="single" w:sz="4" w:space="0" w:color="000000"/>
+              <w:bottom w:val="single" w:sz="4" w:space="0" w:color="000000"/>
+            </w:tcBorders>
+            <w:vAlign w:val="bottom"/>
+          </w:tcPr>
+          <w:p>
+            <w:pPr>
+              <w:pStyle w:val="Normal"/>
+              <w:widowControl w:val="false"/>
+              <w:spacing w:lineRule="auto" w:line="180" w:before="0" w:after="60"/>
+              <w:jc w:val="center"/>
+              <w:rPr>
+                <w:color w:val="000000"/>
+                <w:sz w:val="16"/>
+                <w:szCs w:val="16"/>
+              </w:rPr>
+            </w:pPr>
+            <w:r>
+              <w:rPr>
+                <w:rFonts w:eastAsia="arial" w:ascii="arial" w:hAnsi="arial"/>
+                <w:b/>
+                <w:color w:val="000000"/>
+                <w:sz w:val="16"/>
+                <w:szCs w:val="16"/>
+              </w:rPr>
+              <w:t>Pause</w:t>
+            </w:r>
+          </w:p>
+        </w:tc>
+        <w:tc>
+          <w:tcPr>
+            <w:tcW w:w="1019" w:type="dxa"/>
+            <w:tcBorders>
+              <w:top w:val="single" w:sz="4" w:space="0" w:color="000000"/>
+              <w:left w:val="single" w:sz="4" w:space="0" w:color="000000"/>
+              <w:bottom w:val="single" w:sz="4" w:space="0" w:color="000000"/>
+            </w:tcBorders>
+            <w:vAlign w:val="bottom"/>
+          </w:tcPr>
+          <w:p>
+            <w:pPr>
+              <w:pStyle w:val="Normal"/>
+              <w:widowControl w:val="false"/>
+              <w:spacing w:lineRule="auto" w:line="180"/>
+              <w:jc w:val="center"/>
+              <w:rPr>
+                <w:color w:val="000000"/>
+                <w:sz w:val="16"/>
+                <w:szCs w:val="16"/>
+              </w:rPr>
+            </w:pPr>
+            <w:r>
+              <w:rPr>
+                <w:color w:val="000000"/>
+                <w:sz w:val="16"/>
+                <w:szCs w:val="16"/>
+              </w:rPr>
+            </w:r>
+          </w:p>
+        </w:tc>
+        <w:tc>
+          <w:tcPr>
+            <w:tcW w:w="1014" w:type="dxa"/>
+            <w:tcBorders>
+              <w:top w:val="single" w:sz="4" w:space="0" w:color="000000"/>
+              <w:left w:val="single" w:sz="4" w:space="0" w:color="000000"/>
+              <w:bottom w:val="single" w:sz="4" w:space="0" w:color="000000"/>
+            </w:tcBorders>
+            <w:vAlign w:val="bottom"/>
+          </w:tcPr>
+          <w:p>
+            <w:pPr>
+              <w:pStyle w:val="Normal"/>
+              <w:widowControl w:val="false"/>
+              <w:spacing w:lineRule="auto" w:line="180"/>
+              <w:jc w:val="center"/>
+              <w:rPr>
+                <w:color w:val="000000"/>
+                <w:sz w:val="16"/>
+                <w:szCs w:val="16"/>
+              </w:rPr>
+            </w:pPr>
+            <w:r>
+              <w:rPr>
+                <w:color w:val="000000"/>
+                <w:sz w:val="16"/>
+                <w:szCs w:val="16"/>
+              </w:rPr>
+              <w:t>MCB Close</w:t>
+            </w:r>
+          </w:p>
+        </w:tc>
+        <w:tc>
+          <w:tcPr>
+            <w:tcW w:w="1016" w:type="dxa"/>
+            <w:tcBorders>
+              <w:top w:val="single" w:sz="4" w:space="0" w:color="000000"/>
+              <w:left w:val="single" w:sz="4" w:space="0" w:color="000000"/>
+              <w:bottom w:val="single" w:sz="4" w:space="0" w:color="000000"/>
+            </w:tcBorders>
+            <w:vAlign w:val="bottom"/>
+          </w:tcPr>
+          <w:p>
+            <w:pPr>
+              <w:pStyle w:val="Normal"/>
+              <w:widowControl w:val="false"/>
+              <w:spacing w:lineRule="auto" w:line="180"/>
+              <w:jc w:val="center"/>
+              <w:rPr>
+                <w:sz w:val="16"/>
+                <w:szCs w:val="16"/>
+              </w:rPr>
+            </w:pPr>
+            <w:r>
+              <w:rPr>
+                <w:rFonts w:eastAsia="arial" w:ascii="arial" w:hAnsi="arial"/>
+                <w:color w:val="000000"/>
+                <w:sz w:val="16"/>
+                <w:szCs w:val="16"/>
+              </w:rPr>
+              <w:t>PZB</w:t>
+            </w:r>
+          </w:p>
+        </w:tc>
+        <w:tc>
+          <w:tcPr>
+            <w:tcW w:w="1020" w:type="dxa"/>
+            <w:tcBorders>
+              <w:top w:val="single" w:sz="4" w:space="0" w:color="000000"/>
+              <w:left w:val="single" w:sz="4" w:space="0" w:color="000000"/>
+              <w:bottom w:val="single" w:sz="4" w:space="0" w:color="000000"/>
+            </w:tcBorders>
+            <w:vAlign w:val="bottom"/>
+          </w:tcPr>
+          <w:p>
+            <w:pPr>
+              <w:pStyle w:val="Normal"/>
+              <w:widowControl w:val="false"/>
+              <w:spacing w:lineRule="auto" w:line="180"/>
+              <w:jc w:val="center"/>
+              <w:rPr>
+                <w:color w:val="000000"/>
+                <w:sz w:val="16"/>
+                <w:szCs w:val="16"/>
+              </w:rPr>
+            </w:pPr>
+            <w:r>
+              <w:rPr>
+                <w:rFonts w:eastAsia="arial" w:ascii="arial" w:hAnsi="arial"/>
+                <w:color w:val="000000"/>
+                <w:sz w:val="16"/>
+                <w:szCs w:val="16"/>
+              </w:rPr>
+              <w:t>Panto. Raise</w:t>
+            </w:r>
+          </w:p>
+        </w:tc>
+        <w:tc>
+          <w:tcPr>
+            <w:tcW w:w="1016" w:type="dxa"/>
+            <w:tcBorders>
+              <w:top w:val="single" w:sz="4" w:space="0" w:color="000000"/>
+              <w:left w:val="single" w:sz="4" w:space="0" w:color="000000"/>
+              <w:bottom w:val="single" w:sz="4" w:space="0" w:color="000000"/>
+            </w:tcBorders>
+            <w:vAlign w:val="bottom"/>
+          </w:tcPr>
+          <w:p>
+            <w:pPr>
+              <w:pStyle w:val="Normal"/>
+              <w:widowControl w:val="false"/>
+              <w:jc w:val="center"/>
+              <w:rPr>
+                <w:color w:val="000000"/>
+                <w:sz w:val="16"/>
+                <w:szCs w:val="16"/>
+              </w:rPr>
+            </w:pPr>
+            <w:r>
+              <w:rPr>
+                <w:color w:val="000000"/>
+                <w:sz w:val="16"/>
+                <w:szCs w:val="16"/>
+              </w:rPr>
+              <w:t>Pass.</w:t>
+            </w:r>
+          </w:p>
+          <w:p>
+            <w:pPr>
+              <w:pStyle w:val="Normal"/>
+              <w:widowControl w:val="false"/>
+              <w:jc w:val="center"/>
+              <w:rPr>
+                <w:color w:val="000000"/>
+                <w:sz w:val="16"/>
+                <w:szCs w:val="16"/>
+              </w:rPr>
+            </w:pPr>
+            <w:r>
+              <w:rPr>
+                <w:color w:val="000000"/>
+                <w:sz w:val="16"/>
+                <w:szCs w:val="16"/>
+              </w:rPr>
+              <w:t>Light On</w:t>
+            </w:r>
+          </w:p>
+        </w:tc>
+        <w:tc>
+          <w:tcPr>
+            <w:tcW w:w="1016" w:type="dxa"/>
+            <w:tcBorders>
+              <w:top w:val="single" w:sz="4" w:space="0" w:color="000000"/>
+              <w:left w:val="single" w:sz="4" w:space="0" w:color="000000"/>
+              <w:bottom w:val="single" w:sz="4" w:space="0" w:color="000000"/>
+            </w:tcBorders>
+            <w:vAlign w:val="bottom"/>
+          </w:tcPr>
+          <w:p>
+            <w:pPr>
+              <w:pStyle w:val="Normal"/>
+              <w:widowControl w:val="false"/>
+              <w:jc w:val="center"/>
+              <w:rPr>
+                <w:sz w:val="16"/>
+                <w:szCs w:val="16"/>
+              </w:rPr>
+            </w:pPr>
+            <w:r>
+              <w:rPr>
+                <w:sz w:val="16"/>
+                <w:szCs w:val="16"/>
+              </w:rPr>
+              <w:t>Door Step Release</w:t>
+            </w:r>
+          </w:p>
+        </w:tc>
+        <w:tc>
+          <w:tcPr>
+            <w:tcW w:w="1017" w:type="dxa"/>
+            <w:tcBorders>
+              <w:top w:val="single" w:sz="4" w:space="0" w:color="000000"/>
+              <w:left w:val="single" w:sz="4" w:space="0" w:color="000000"/>
+              <w:bottom w:val="single" w:sz="4" w:space="0" w:color="000000"/>
+            </w:tcBorders>
+            <w:vAlign w:val="bottom"/>
+          </w:tcPr>
+          <w:p>
+            <w:pPr>
+              <w:pStyle w:val="Normal"/>
+              <w:widowControl w:val="false"/>
+              <w:jc w:val="center"/>
+              <w:rPr>
+                <w:rFonts w:ascii="arial" w:hAnsi="arial" w:eastAsia="arial"/>
+                <w:color w:val="000000"/>
+                <w:sz w:val="16"/>
+                <w:szCs w:val="16"/>
+              </w:rPr>
+            </w:pPr>
+            <w:r>
+              <w:rPr>
+                <w:rFonts w:eastAsia="arial" w:ascii="arial" w:hAnsi="arial"/>
+                <w:color w:val="000000"/>
+                <w:sz w:val="16"/>
+                <w:szCs w:val="16"/>
+              </w:rPr>
+              <w:t>Master Key Up</w:t>
+            </w:r>
+          </w:p>
+        </w:tc>
+        <w:tc>
+          <w:tcPr>
+            <w:tcW w:w="1016" w:type="dxa"/>
+            <w:tcBorders>
+              <w:top w:val="single" w:sz="4" w:space="0" w:color="000000"/>
+              <w:left w:val="single" w:sz="4" w:space="0" w:color="000000"/>
+              <w:bottom w:val="single" w:sz="4" w:space="0" w:color="000000"/>
+            </w:tcBorders>
+            <w:vAlign w:val="bottom"/>
+          </w:tcPr>
+          <w:p>
+            <w:pPr>
+              <w:pStyle w:val="Normal"/>
+              <w:widowControl w:val="false"/>
+              <w:spacing w:lineRule="auto" w:line="180"/>
+              <w:jc w:val="center"/>
+              <w:rPr>
+                <w:color w:val="000000"/>
+                <w:sz w:val="16"/>
+                <w:szCs w:val="16"/>
+              </w:rPr>
+            </w:pPr>
+            <w:r>
+              <w:rPr>
+                <w:rFonts w:eastAsia="arial" w:ascii="arial" w:hAnsi="arial"/>
+                <w:color w:val="000000"/>
+                <w:sz w:val="16"/>
+                <w:szCs w:val="16"/>
+              </w:rPr>
+              <w:t>Reading</w:t>
+            </w:r>
+            <w:r>
+              <w:rPr>
+                <w:rFonts w:eastAsia="arial" w:ascii="arial" w:hAnsi="arial"/>
+                <w:color w:val="000000"/>
+                <w:sz w:val="16"/>
+                <w:szCs w:val="16"/>
+              </w:rPr>
+              <w:t xml:space="preserve"> Light Up</w:t>
+            </w:r>
+          </w:p>
+        </w:tc>
+        <w:tc>
+          <w:tcPr>
+            <w:tcW w:w="1020" w:type="dxa"/>
+            <w:tcBorders>
+              <w:top w:val="single" w:sz="4" w:space="0" w:color="000000"/>
+              <w:left w:val="single" w:sz="4" w:space="0" w:color="000000"/>
+              <w:bottom w:val="single" w:sz="4" w:space="0" w:color="000000"/>
+            </w:tcBorders>
+            <w:vAlign w:val="bottom"/>
+          </w:tcPr>
+          <w:p>
+            <w:pPr>
+              <w:pStyle w:val="Normal"/>
+              <w:widowControl w:val="false"/>
+              <w:jc w:val="center"/>
+              <w:rPr>
+                <w:color w:val="000000"/>
+                <w:sz w:val="16"/>
+                <w:szCs w:val="16"/>
+              </w:rPr>
+            </w:pPr>
+            <w:r>
+              <w:rPr>
+                <w:rFonts w:eastAsia="arial" w:ascii="arial" w:hAnsi="arial"/>
+                <w:color w:val="000000"/>
+                <w:sz w:val="16"/>
+                <w:szCs w:val="16"/>
+              </w:rPr>
+              <w:t>Desk Light Up</w:t>
+            </w:r>
+          </w:p>
+        </w:tc>
+        <w:tc>
+          <w:tcPr>
+            <w:tcW w:w="1016" w:type="dxa"/>
+            <w:tcBorders>
+              <w:top w:val="single" w:sz="4" w:space="0" w:color="000000"/>
+              <w:left w:val="single" w:sz="4" w:space="0" w:color="000000"/>
+              <w:bottom w:val="single" w:sz="4" w:space="0" w:color="000000"/>
+            </w:tcBorders>
+            <w:vAlign w:val="bottom"/>
+          </w:tcPr>
+          <w:p>
+            <w:pPr>
+              <w:pStyle w:val="Normal"/>
+              <w:widowControl w:val="false"/>
+              <w:spacing w:lineRule="auto" w:line="180"/>
+              <w:jc w:val="center"/>
+              <w:rPr>
+                <w:color w:val="000000"/>
+                <w:sz w:val="16"/>
+                <w:szCs w:val="16"/>
+              </w:rPr>
+            </w:pPr>
+            <w:r>
+              <w:rPr>
+                <w:rFonts w:eastAsia="arial" w:ascii="arial" w:hAnsi="arial"/>
+                <w:color w:val="000000"/>
+                <w:sz w:val="16"/>
+                <w:szCs w:val="16"/>
+              </w:rPr>
+              <w:t>Gauge Light Up</w:t>
+            </w:r>
+          </w:p>
+        </w:tc>
+        <w:tc>
+          <w:tcPr>
+            <w:tcW w:w="1016" w:type="dxa"/>
+            <w:tcBorders>
+              <w:top w:val="single" w:sz="4" w:space="0" w:color="000000"/>
+              <w:left w:val="single" w:sz="4" w:space="0" w:color="000000"/>
+              <w:bottom w:val="single" w:sz="4" w:space="0" w:color="000000"/>
+            </w:tcBorders>
+            <w:vAlign w:val="bottom"/>
+          </w:tcPr>
+          <w:p>
+            <w:pPr>
+              <w:pStyle w:val="Normal"/>
+              <w:widowControl w:val="false"/>
+              <w:spacing w:lineRule="auto" w:line="180"/>
+              <w:jc w:val="center"/>
+              <w:rPr>
+                <w:sz w:val="16"/>
+                <w:szCs w:val="16"/>
+              </w:rPr>
+            </w:pPr>
+            <w:r>
+              <w:rPr>
+                <w:rFonts w:eastAsia="arial" w:ascii="arial" w:hAnsi="arial"/>
+                <w:color w:val="000000"/>
+                <w:sz w:val="16"/>
+                <w:szCs w:val="16"/>
+              </w:rPr>
+              <w:t>Cab Light</w:t>
+            </w:r>
+          </w:p>
+          <w:p>
+            <w:pPr>
+              <w:pStyle w:val="Normal"/>
+              <w:widowControl w:val="false"/>
+              <w:spacing w:lineRule="auto" w:line="180"/>
+              <w:jc w:val="center"/>
+              <w:rPr>
+                <w:sz w:val="16"/>
+                <w:szCs w:val="16"/>
+              </w:rPr>
+            </w:pPr>
+            <w:r>
+              <w:rPr>
+                <w:sz w:val="16"/>
+                <w:szCs w:val="16"/>
+              </w:rPr>
+              <w:t>On</w:t>
+            </w:r>
+          </w:p>
+        </w:tc>
+        <w:tc>
+          <w:tcPr>
+            <w:tcW w:w="1016" w:type="dxa"/>
+            <w:tcBorders>
+              <w:top w:val="single" w:sz="4" w:space="0" w:color="000000"/>
+              <w:left w:val="single" w:sz="4" w:space="0" w:color="000000"/>
+              <w:bottom w:val="single" w:sz="4" w:space="0" w:color="000000"/>
+            </w:tcBorders>
+            <w:vAlign w:val="bottom"/>
+          </w:tcPr>
+          <w:p>
+            <w:pPr>
+              <w:pStyle w:val="Normal"/>
+              <w:widowControl w:val="false"/>
+              <w:spacing w:lineRule="auto" w:line="180"/>
+              <w:jc w:val="center"/>
+              <w:rPr>
+                <w:color w:val="000000"/>
+                <w:sz w:val="16"/>
+                <w:szCs w:val="16"/>
+              </w:rPr>
+            </w:pPr>
+            <w:r>
+              <w:rPr>
+                <w:rFonts w:eastAsia="arial" w:ascii="arial" w:hAnsi="arial"/>
+                <w:color w:val="000000"/>
+                <w:sz w:val="16"/>
+                <w:szCs w:val="16"/>
+              </w:rPr>
+              <w:t>1P Cam</w:t>
+            </w:r>
+          </w:p>
+        </w:tc>
+        <w:tc>
+          <w:tcPr>
+            <w:tcW w:w="1029" w:type="dxa"/>
+            <w:tcBorders>
+              <w:top w:val="single" w:sz="4" w:space="0" w:color="000000"/>
+              <w:left w:val="single" w:sz="4" w:space="0" w:color="000000"/>
+              <w:bottom w:val="single" w:sz="4" w:space="0" w:color="000000"/>
+              <w:right w:val="single" w:sz="4" w:space="0" w:color="000000"/>
+            </w:tcBorders>
+            <w:vAlign w:val="bottom"/>
+          </w:tcPr>
+          <w:p>
+            <w:pPr>
+              <w:pStyle w:val="Normal"/>
+              <w:widowControl w:val="false"/>
+              <w:spacing w:lineRule="auto" w:line="180"/>
+              <w:jc w:val="center"/>
+              <w:rPr>
+                <w:color w:val="000000"/>
+                <w:sz w:val="16"/>
+                <w:szCs w:val="16"/>
+              </w:rPr>
+            </w:pPr>
+            <w:r>
+              <w:rPr>
+                <w:rFonts w:eastAsia="arial" w:ascii="arial" w:hAnsi="arial"/>
+                <w:color w:val="000000"/>
+                <w:sz w:val="16"/>
+                <w:szCs w:val="16"/>
+              </w:rPr>
+              <w:t>Next</w:t>
+            </w:r>
+          </w:p>
+          <w:p>
+            <w:pPr>
+              <w:pStyle w:val="Normal"/>
+              <w:widowControl w:val="false"/>
+              <w:spacing w:lineRule="auto" w:line="180"/>
+              <w:jc w:val="center"/>
+              <w:rPr>
+                <w:color w:val="000000"/>
+                <w:sz w:val="16"/>
+                <w:szCs w:val="16"/>
+              </w:rPr>
+            </w:pPr>
+            <w:r>
+              <w:rPr>
+                <w:rFonts w:eastAsia="arial" w:ascii="arial" w:hAnsi="arial"/>
+                <w:color w:val="000000"/>
+                <w:sz w:val="16"/>
+                <w:szCs w:val="16"/>
+              </w:rPr>
+              <w:t>Cab Cam</w:t>
+            </w:r>
+          </w:p>
+        </w:tc>
+      </w:tr>
+    </w:tbl>
+    <w:p>
+      <w:pPr>
+        <w:pStyle w:val="Normal"/>
+        <w:rPr>
+          <w:rFonts w:ascii="arial" w:hAnsi="arial" w:eastAsia="arial"/>
+          <w:color w:val="000000"/>
+          <w:sz w:val="16"/>
+          <w:szCs w:val="16"/>
+        </w:rPr>
+      </w:pPr>
+      <w:r>
+        <w:rPr>
+          <w:rFonts w:eastAsia="arial" w:ascii="arial" w:hAnsi="arial"/>
+          <w:color w:val="000000"/>
+          <w:sz w:val="16"/>
+          <w:szCs w:val="16"/>
+        </w:rPr>
+      </w:r>
+    </w:p>
+    <w:p>
+      <w:pPr>
+        <w:pStyle w:val="Normal"/>
+        <w:rPr>
+          <w:color w:val="000000"/>
+          <w:sz w:val="16"/>
+          <w:szCs w:val="16"/>
+        </w:rPr>
+      </w:pPr>
+      <w:r>
+        <w:rPr>
+          <w:rFonts w:eastAsia="arial" w:ascii="arial" w:hAnsi="arial"/>
+          <w:color w:val="000000"/>
+          <w:sz w:val="16"/>
+          <w:szCs w:val="16"/>
+        </w:rPr>
+        <w:tab/>
+        <w:t xml:space="preserve">           DB BR 44</w:t>
+      </w:r>
+      <w:r>
+        <w:rPr>
+          <w:rFonts w:eastAsia="arial" w:ascii="arial" w:hAnsi="arial"/>
+          <w:color w:val="000000"/>
+          <w:sz w:val="16"/>
+          <w:szCs w:val="16"/>
+        </w:rPr>
+        <w:t>0</w:t>
+      </w:r>
+      <w:r>
+        <w:rPr>
+          <w:rFonts w:eastAsia="arial" w:ascii="arial" w:hAnsi="arial"/>
+          <w:color w:val="000000"/>
+          <w:sz w:val="16"/>
+          <w:szCs w:val="16"/>
+        </w:rPr>
+        <w:t>-2</w:t>
+      </w:r>
+    </w:p>
+    <w:tbl>
+      <w:tblPr>
+        <w:tblW w:w="14248" w:type="dxa"/>
+        <w:jc w:val="left"/>
+        <w:tblInd w:w="-5" w:type="dxa"/>
+        <w:tblLayout w:type="fixed"/>
+        <w:tblCellMar>
+          <w:top w:w="0" w:type="dxa"/>
+          <w:left w:w="108" w:type="dxa"/>
+          <w:bottom w:w="0" w:type="dxa"/>
+          <w:right w:w="108" w:type="dxa"/>
+        </w:tblCellMar>
+        <w:tblLook w:firstRow="1" w:noVBand="1" w:lastRow="0" w:firstColumn="1" w:lastColumn="0" w:noHBand="0" w:val="04a0"/>
+      </w:tblPr>
+      <w:tblGrid>
+        <w:gridCol w:w="1017"/>
+        <w:gridCol w:w="1019"/>
+        <w:gridCol w:w="1014"/>
+        <w:gridCol w:w="1016"/>
+        <w:gridCol w:w="1020"/>
+        <w:gridCol w:w="1016"/>
+        <w:gridCol w:w="1016"/>
+        <w:gridCol w:w="1017"/>
+        <w:gridCol w:w="1016"/>
+        <w:gridCol w:w="1020"/>
+        <w:gridCol w:w="1016"/>
+        <w:gridCol w:w="1016"/>
+        <w:gridCol w:w="1016"/>
+        <w:gridCol w:w="1029"/>
+      </w:tblGrid>
+      <w:tr>
+        <w:trPr>
+          <w:trHeight w:val="440" w:hRule="exact"/>
+          <w:cantSplit w:val="true"/>
+        </w:trPr>
+        <w:tc>
+          <w:tcPr>
+            <w:tcW w:w="1017" w:type="dxa"/>
+            <w:tcBorders>
+              <w:top w:val="single" w:sz="4" w:space="0" w:color="000000"/>
+              <w:left w:val="single" w:sz="4" w:space="0" w:color="000000"/>
+              <w:bottom w:val="single" w:sz="4" w:space="0" w:color="000000"/>
+            </w:tcBorders>
+            <w:vAlign w:val="bottom"/>
+          </w:tcPr>
+          <w:p>
+            <w:pPr>
+              <w:pStyle w:val="Normal"/>
+              <w:widowControl w:val="false"/>
+              <w:spacing w:lineRule="auto" w:line="180" w:before="0" w:after="60"/>
+              <w:jc w:val="center"/>
+              <w:rPr>
+                <w:color w:val="000000"/>
+                <w:sz w:val="16"/>
+                <w:szCs w:val="16"/>
+              </w:rPr>
+            </w:pPr>
+            <w:r>
+              <w:rPr>
+                <w:rFonts w:eastAsia="arial" w:ascii="arial" w:hAnsi="arial"/>
+                <w:b/>
+                <w:color w:val="000000"/>
+                <w:sz w:val="16"/>
+                <w:szCs w:val="16"/>
+              </w:rPr>
+              <w:t>HUD</w:t>
+            </w:r>
+          </w:p>
+        </w:tc>
+        <w:tc>
+          <w:tcPr>
+            <w:tcW w:w="1019" w:type="dxa"/>
+            <w:tcBorders>
+              <w:top w:val="single" w:sz="4" w:space="0" w:color="000000"/>
+              <w:left w:val="single" w:sz="4" w:space="0" w:color="000000"/>
+              <w:bottom w:val="single" w:sz="4" w:space="0" w:color="000000"/>
+            </w:tcBorders>
+            <w:vAlign w:val="bottom"/>
+          </w:tcPr>
+          <w:p>
+            <w:pPr>
+              <w:pStyle w:val="Normal"/>
+              <w:widowControl w:val="false"/>
+              <w:spacing w:lineRule="auto" w:line="180"/>
+              <w:jc w:val="center"/>
+              <w:rPr>
+                <w:rFonts w:ascii="arial" w:hAnsi="arial" w:eastAsia="arial"/>
+                <w:color w:val="000000"/>
+                <w:sz w:val="16"/>
+                <w:szCs w:val="16"/>
+              </w:rPr>
+            </w:pPr>
+            <w:r>
+              <w:rPr>
+                <w:rFonts w:eastAsia="arial" w:ascii="arial" w:hAnsi="arial"/>
+                <w:color w:val="000000"/>
+                <w:sz w:val="16"/>
+                <w:szCs w:val="16"/>
+              </w:rPr>
+              <w:t>Schedule</w:t>
+            </w:r>
+          </w:p>
+        </w:tc>
+        <w:tc>
+          <w:tcPr>
+            <w:tcW w:w="1014" w:type="dxa"/>
+            <w:tcBorders>
+              <w:top w:val="single" w:sz="4" w:space="0" w:color="000000"/>
+              <w:left w:val="single" w:sz="4" w:space="0" w:color="000000"/>
+              <w:bottom w:val="single" w:sz="4" w:space="0" w:color="000000"/>
+            </w:tcBorders>
+            <w:vAlign w:val="bottom"/>
+          </w:tcPr>
+          <w:p>
+            <w:pPr>
+              <w:pStyle w:val="Normal"/>
+              <w:widowControl w:val="false"/>
+              <w:spacing w:lineRule="auto" w:line="180"/>
+              <w:jc w:val="center"/>
+              <w:rPr>
+                <w:color w:val="000000"/>
+                <w:sz w:val="16"/>
+                <w:szCs w:val="16"/>
+              </w:rPr>
+            </w:pPr>
+            <w:r>
+              <w:rPr>
+                <w:rFonts w:eastAsia="arial" w:ascii="arial" w:hAnsi="arial"/>
+                <w:color w:val="000000"/>
+                <w:sz w:val="16"/>
+                <w:szCs w:val="16"/>
+              </w:rPr>
+              <w:t>MCB Open</w:t>
+            </w:r>
+          </w:p>
+        </w:tc>
+        <w:tc>
+          <w:tcPr>
+            <w:tcW w:w="1016" w:type="dxa"/>
+            <w:tcBorders>
+              <w:top w:val="single" w:sz="4" w:space="0" w:color="000000"/>
+              <w:left w:val="single" w:sz="4" w:space="0" w:color="000000"/>
+              <w:bottom w:val="single" w:sz="4" w:space="0" w:color="000000"/>
+            </w:tcBorders>
+            <w:vAlign w:val="bottom"/>
+          </w:tcPr>
+          <w:p>
+            <w:pPr>
+              <w:pStyle w:val="Normal"/>
+              <w:widowControl w:val="false"/>
+              <w:spacing w:lineRule="auto" w:line="180"/>
+              <w:jc w:val="center"/>
+              <w:rPr>
+                <w:sz w:val="16"/>
+                <w:szCs w:val="16"/>
+              </w:rPr>
+            </w:pPr>
+            <w:r>
+              <w:rPr>
+                <w:sz w:val="16"/>
+                <w:szCs w:val="16"/>
+              </w:rPr>
+              <w:t>Sifa</w:t>
+            </w:r>
+          </w:p>
+        </w:tc>
+        <w:tc>
+          <w:tcPr>
+            <w:tcW w:w="1020" w:type="dxa"/>
+            <w:tcBorders>
+              <w:top w:val="single" w:sz="4" w:space="0" w:color="000000"/>
+              <w:left w:val="single" w:sz="4" w:space="0" w:color="000000"/>
+              <w:bottom w:val="single" w:sz="4" w:space="0" w:color="000000"/>
+            </w:tcBorders>
+            <w:vAlign w:val="bottom"/>
+          </w:tcPr>
+          <w:p>
+            <w:pPr>
+              <w:pStyle w:val="Normal"/>
+              <w:widowControl w:val="false"/>
+              <w:jc w:val="center"/>
+              <w:rPr>
+                <w:rFonts w:ascii="arial" w:hAnsi="arial" w:eastAsia="arial"/>
+                <w:color w:val="000000"/>
+                <w:sz w:val="16"/>
+                <w:szCs w:val="16"/>
+              </w:rPr>
+            </w:pPr>
+            <w:r>
+              <w:rPr>
+                <w:rFonts w:eastAsia="arial" w:ascii="arial" w:hAnsi="arial"/>
+                <w:color w:val="000000"/>
+                <w:sz w:val="16"/>
+                <w:szCs w:val="16"/>
+              </w:rPr>
+              <w:t>Panto.</w:t>
+            </w:r>
+          </w:p>
+          <w:p>
+            <w:pPr>
+              <w:pStyle w:val="Normal"/>
+              <w:widowControl w:val="false"/>
+              <w:jc w:val="center"/>
+              <w:rPr>
+                <w:rFonts w:ascii="arial" w:hAnsi="arial" w:eastAsia="arial"/>
+                <w:color w:val="000000"/>
+                <w:sz w:val="16"/>
+                <w:szCs w:val="16"/>
+              </w:rPr>
+            </w:pPr>
+            <w:r>
+              <w:rPr>
+                <w:rFonts w:eastAsia="arial" w:ascii="arial" w:hAnsi="arial"/>
+                <w:color w:val="000000"/>
+                <w:sz w:val="16"/>
+                <w:szCs w:val="16"/>
+              </w:rPr>
+              <w:t>Low</w:t>
+            </w:r>
+          </w:p>
+        </w:tc>
+        <w:tc>
+          <w:tcPr>
+            <w:tcW w:w="1016" w:type="dxa"/>
+            <w:tcBorders>
+              <w:top w:val="single" w:sz="4" w:space="0" w:color="000000"/>
+              <w:left w:val="single" w:sz="4" w:space="0" w:color="000000"/>
+              <w:bottom w:val="single" w:sz="4" w:space="0" w:color="000000"/>
+            </w:tcBorders>
+            <w:vAlign w:val="bottom"/>
+          </w:tcPr>
+          <w:p>
+            <w:pPr>
+              <w:pStyle w:val="Normal"/>
+              <w:widowControl w:val="false"/>
+              <w:jc w:val="center"/>
+              <w:rPr>
+                <w:color w:val="000000"/>
+                <w:sz w:val="16"/>
+                <w:szCs w:val="16"/>
+              </w:rPr>
+            </w:pPr>
+            <w:r>
+              <w:rPr>
+                <w:color w:val="000000"/>
+                <w:sz w:val="16"/>
+                <w:szCs w:val="16"/>
+              </w:rPr>
+              <w:t>Pass.</w:t>
+            </w:r>
+          </w:p>
+          <w:p>
+            <w:pPr>
+              <w:pStyle w:val="Normal"/>
+              <w:widowControl w:val="false"/>
+              <w:jc w:val="center"/>
+              <w:rPr>
+                <w:color w:val="000000"/>
+                <w:sz w:val="16"/>
+                <w:szCs w:val="16"/>
+              </w:rPr>
+            </w:pPr>
+            <w:r>
+              <w:rPr>
+                <w:color w:val="000000"/>
+                <w:sz w:val="16"/>
+                <w:szCs w:val="16"/>
+              </w:rPr>
+              <w:t>Light Off</w:t>
+            </w:r>
+          </w:p>
+        </w:tc>
+        <w:tc>
+          <w:tcPr>
+            <w:tcW w:w="1016" w:type="dxa"/>
+            <w:tcBorders>
+              <w:top w:val="single" w:sz="4" w:space="0" w:color="000000"/>
+              <w:left w:val="single" w:sz="4" w:space="0" w:color="000000"/>
+              <w:bottom w:val="single" w:sz="4" w:space="0" w:color="000000"/>
+            </w:tcBorders>
+            <w:vAlign w:val="bottom"/>
+          </w:tcPr>
+          <w:p>
+            <w:pPr>
+              <w:pStyle w:val="Normal"/>
+              <w:widowControl w:val="false"/>
+              <w:jc w:val="center"/>
+              <w:rPr>
+                <w:sz w:val="16"/>
+                <w:szCs w:val="16"/>
+              </w:rPr>
+            </w:pPr>
+            <w:r>
+              <w:rPr>
+                <w:sz w:val="16"/>
+                <w:szCs w:val="16"/>
+              </w:rPr>
+              <w:t>High Beam</w:t>
+            </w:r>
+          </w:p>
+        </w:tc>
+        <w:tc>
+          <w:tcPr>
+            <w:tcW w:w="1017" w:type="dxa"/>
+            <w:tcBorders>
+              <w:top w:val="single" w:sz="4" w:space="0" w:color="000000"/>
+              <w:left w:val="single" w:sz="4" w:space="0" w:color="000000"/>
+              <w:bottom w:val="single" w:sz="4" w:space="0" w:color="000000"/>
+            </w:tcBorders>
+            <w:vAlign w:val="bottom"/>
+          </w:tcPr>
+          <w:p>
+            <w:pPr>
+              <w:pStyle w:val="Normal"/>
+              <w:widowControl w:val="false"/>
+              <w:jc w:val="center"/>
+              <w:rPr>
+                <w:sz w:val="16"/>
+                <w:szCs w:val="16"/>
+              </w:rPr>
+            </w:pPr>
+            <w:r>
+              <w:rPr>
+                <w:sz w:val="16"/>
+                <w:szCs w:val="16"/>
+              </w:rPr>
+              <w:t>Master Key Down</w:t>
+            </w:r>
+          </w:p>
+        </w:tc>
+        <w:tc>
+          <w:tcPr>
+            <w:tcW w:w="1016" w:type="dxa"/>
+            <w:tcBorders>
+              <w:top w:val="single" w:sz="4" w:space="0" w:color="000000"/>
+              <w:left w:val="single" w:sz="4" w:space="0" w:color="000000"/>
+              <w:bottom w:val="single" w:sz="4" w:space="0" w:color="000000"/>
+            </w:tcBorders>
+            <w:vAlign w:val="bottom"/>
+          </w:tcPr>
+          <w:p>
+            <w:pPr>
+              <w:pStyle w:val="Normal"/>
+              <w:widowControl w:val="false"/>
+              <w:spacing w:lineRule="auto" w:line="180"/>
+              <w:jc w:val="center"/>
+              <w:rPr>
+                <w:color w:val="000000"/>
+                <w:sz w:val="16"/>
+                <w:szCs w:val="16"/>
+              </w:rPr>
+            </w:pPr>
+            <w:r>
+              <w:rPr>
+                <w:rFonts w:eastAsia="arial" w:ascii="arial" w:hAnsi="arial"/>
+                <w:color w:val="000000"/>
+                <w:sz w:val="16"/>
+                <w:szCs w:val="16"/>
+              </w:rPr>
+              <w:t>Reading</w:t>
+            </w:r>
+            <w:r>
+              <w:rPr>
+                <w:rFonts w:eastAsia="arial" w:ascii="arial" w:hAnsi="arial"/>
+                <w:color w:val="000000"/>
+                <w:sz w:val="16"/>
+                <w:szCs w:val="16"/>
+              </w:rPr>
+              <w:t xml:space="preserve"> Light Dw</w:t>
+            </w:r>
+          </w:p>
+        </w:tc>
+        <w:tc>
+          <w:tcPr>
+            <w:tcW w:w="1020" w:type="dxa"/>
+            <w:tcBorders>
+              <w:top w:val="single" w:sz="4" w:space="0" w:color="000000"/>
+              <w:left w:val="single" w:sz="4" w:space="0" w:color="000000"/>
+              <w:bottom w:val="single" w:sz="4" w:space="0" w:color="000000"/>
+            </w:tcBorders>
+            <w:vAlign w:val="bottom"/>
+          </w:tcPr>
+          <w:p>
+            <w:pPr>
+              <w:pStyle w:val="Normal"/>
+              <w:widowControl w:val="false"/>
+              <w:jc w:val="center"/>
+              <w:rPr>
+                <w:color w:val="000000"/>
+                <w:sz w:val="16"/>
+                <w:szCs w:val="16"/>
+              </w:rPr>
+            </w:pPr>
+            <w:r>
+              <w:rPr>
+                <w:rFonts w:eastAsia="arial" w:ascii="arial" w:hAnsi="arial"/>
+                <w:color w:val="000000"/>
+                <w:sz w:val="16"/>
+                <w:szCs w:val="16"/>
+              </w:rPr>
+              <w:t>Desk Light Dw</w:t>
+            </w:r>
+          </w:p>
+        </w:tc>
+        <w:tc>
+          <w:tcPr>
+            <w:tcW w:w="1016" w:type="dxa"/>
+            <w:tcBorders>
+              <w:top w:val="single" w:sz="4" w:space="0" w:color="000000"/>
+              <w:left w:val="single" w:sz="4" w:space="0" w:color="000000"/>
+              <w:bottom w:val="single" w:sz="4" w:space="0" w:color="000000"/>
+            </w:tcBorders>
+            <w:vAlign w:val="bottom"/>
+          </w:tcPr>
+          <w:p>
+            <w:pPr>
+              <w:pStyle w:val="Normal"/>
+              <w:widowControl w:val="false"/>
+              <w:spacing w:lineRule="auto" w:line="180"/>
+              <w:jc w:val="center"/>
+              <w:rPr>
+                <w:color w:val="000000"/>
+                <w:sz w:val="16"/>
+                <w:szCs w:val="16"/>
+              </w:rPr>
+            </w:pPr>
+            <w:r>
+              <w:rPr>
+                <w:rFonts w:eastAsia="arial" w:ascii="arial" w:hAnsi="arial"/>
+                <w:color w:val="000000"/>
+                <w:sz w:val="16"/>
+                <w:szCs w:val="16"/>
+              </w:rPr>
+              <w:t>Gauge Light Dw</w:t>
+            </w:r>
+          </w:p>
+        </w:tc>
+        <w:tc>
+          <w:tcPr>
+            <w:tcW w:w="1016" w:type="dxa"/>
+            <w:tcBorders>
+              <w:top w:val="single" w:sz="4" w:space="0" w:color="000000"/>
+              <w:left w:val="single" w:sz="4" w:space="0" w:color="000000"/>
+              <w:bottom w:val="single" w:sz="4" w:space="0" w:color="000000"/>
+            </w:tcBorders>
+            <w:vAlign w:val="bottom"/>
+          </w:tcPr>
+          <w:p>
+            <w:pPr>
+              <w:pStyle w:val="Normal"/>
+              <w:widowControl w:val="false"/>
+              <w:spacing w:lineRule="auto" w:line="180"/>
+              <w:jc w:val="center"/>
+              <w:rPr>
+                <w:sz w:val="16"/>
+                <w:szCs w:val="16"/>
+              </w:rPr>
+            </w:pPr>
+            <w:r>
+              <w:rPr>
+                <w:rFonts w:eastAsia="arial" w:ascii="arial" w:hAnsi="arial"/>
+                <w:color w:val="000000"/>
+                <w:sz w:val="16"/>
+                <w:szCs w:val="16"/>
+              </w:rPr>
+              <w:t>Cab Light</w:t>
+            </w:r>
+          </w:p>
+          <w:p>
+            <w:pPr>
+              <w:pStyle w:val="Normal"/>
+              <w:widowControl w:val="false"/>
+              <w:spacing w:lineRule="auto" w:line="180"/>
+              <w:jc w:val="center"/>
+              <w:rPr>
+                <w:sz w:val="16"/>
+                <w:szCs w:val="16"/>
+              </w:rPr>
+            </w:pPr>
+            <w:r>
+              <w:rPr>
+                <w:sz w:val="16"/>
+                <w:szCs w:val="16"/>
+              </w:rPr>
+              <w:t>Off</w:t>
             </w:r>
           </w:p>
         </w:tc>
@@ -49337,13 +50618,13 @@
       <w:rFonts w:ascii="Symbol" w:hAnsi="Symbol" w:cs="Symbol"/>
     </w:rPr>
   </w:style>
-  <w:style w:type="character" w:styleId="Style5" w:customStyle="1">
-    <w:name w:val="번호 매기기 기호"/>
+  <w:style w:type="character" w:styleId="user" w:customStyle="1">
+    <w:name w:val="번호 매기기 기호 (user)"/>
     <w:qFormat/>
     <w:rPr/>
   </w:style>
-  <w:style w:type="character" w:styleId="user">
-    <w:name w:val="번호 매기기 기호 (user)"/>
+  <w:style w:type="character" w:styleId="Style5">
+    <w:name w:val="번호 매기기 기호"/>
     <w:qFormat/>
     <w:rPr/>
   </w:style>
@@ -49357,7 +50638,7 @@
       <w:spacing w:before="240" w:after="120"/>
     </w:pPr>
     <w:rPr>
-      <w:rFonts w:ascii="Liberation Sans" w:hAnsi="Liberation Sans" w:eastAsia="Noto Sans KR" w:cs="Arial"/>
+      <w:rFonts w:ascii="Liberation Sans" w:hAnsi="Liberation Sans" w:eastAsia="Noto Sans CJK KR" w:cs="Lohit Devanagari"/>
       <w:sz w:val="28"/>
       <w:szCs w:val="28"/>
     </w:rPr>
@@ -49394,7 +50675,7 @@
       <w:szCs w:val="24"/>
     </w:rPr>
   </w:style>
-  <w:style w:type="paragraph" w:styleId="Style7">
+  <w:style w:type="paragraph" w:styleId="Style7" w:customStyle="1">
     <w:name w:val="색인"/>
     <w:basedOn w:val="Normal"/>
     <w:qFormat/>
@@ -49402,8 +50683,7 @@
       <w:suppressLineNumbers/>
     </w:pPr>
     <w:rPr>
-      <w:rFonts w:cs="Arial"/>
-      <w:sz w:val="24"/>
+      <w:rFonts w:cs="Lohit Devanagari"/>
     </w:rPr>
   </w:style>
   <w:style w:type="paragraph" w:styleId="user1">
@@ -49416,12 +50696,12 @@
       <w:spacing w:before="240" w:after="120"/>
     </w:pPr>
     <w:rPr>
-      <w:rFonts w:ascii="Liberation Sans" w:hAnsi="Liberation Sans" w:eastAsia="Noto Sans CJK KR" w:cs="Lohit Devanagari"/>
+      <w:rFonts w:ascii="Liberation Sans" w:hAnsi="Liberation Sans" w:eastAsia="Noto Sans KR" w:cs="Arial"/>
       <w:sz w:val="28"/>
       <w:szCs w:val="28"/>
     </w:rPr>
   </w:style>
-  <w:style w:type="paragraph" w:styleId="user2" w:customStyle="1">
+  <w:style w:type="paragraph" w:styleId="user2">
     <w:name w:val="색인 (user)"/>
     <w:basedOn w:val="Normal"/>
     <w:qFormat/>
@@ -49429,7 +50709,8 @@
       <w:suppressLineNumbers/>
     </w:pPr>
     <w:rPr>
-      <w:rFonts w:cs="Lohit Devanagari"/>
+      <w:rFonts w:cs="Arial"/>
+      <w:sz w:val="24"/>
     </w:rPr>
   </w:style>
   <w:style w:type="paragraph" w:styleId="Title">
@@ -50111,8 +51392,8 @@
       <w:szCs w:val="24"/>
     </w:rPr>
   </w:style>
-  <w:style w:type="paragraph" w:styleId="user3" w:customStyle="1">
-    <w:name w:val="표 내용 (user)"/>
+  <w:style w:type="paragraph" w:styleId="Style8" w:customStyle="1">
+    <w:name w:val="표 내용"/>
     <w:basedOn w:val="Normal"/>
     <w:qFormat/>
     <w:pPr>
@@ -50120,9 +51401,9 @@
     </w:pPr>
     <w:rPr/>
   </w:style>
-  <w:style w:type="paragraph" w:styleId="user4" w:customStyle="1">
-    <w:name w:val="표제목 (user)"/>
-    <w:basedOn w:val="user3"/>
+  <w:style w:type="paragraph" w:styleId="Style9" w:customStyle="1">
+    <w:name w:val="표제목"/>
+    <w:basedOn w:val="Style8"/>
     <w:qFormat/>
     <w:pPr>
       <w:jc w:val="center"/>
@@ -50132,8 +51413,8 @@
       <w:bCs/>
     </w:rPr>
   </w:style>
-  <w:style w:type="paragraph" w:styleId="Style8">
-    <w:name w:val="표 내용"/>
+  <w:style w:type="paragraph" w:styleId="user3">
+    <w:name w:val="표 내용 (user)"/>
     <w:basedOn w:val="Normal"/>
     <w:qFormat/>
     <w:pPr>
@@ -50142,9 +51423,9 @@
     </w:pPr>
     <w:rPr/>
   </w:style>
-  <w:style w:type="paragraph" w:styleId="Style9">
-    <w:name w:val="표제목"/>
-    <w:basedOn w:val="Style8"/>
+  <w:style w:type="paragraph" w:styleId="user4">
+    <w:name w:val="표제목 (user)"/>
+    <w:basedOn w:val="user3"/>
     <w:qFormat/>
     <w:pPr>
       <w:suppressLineNumbers/>

</xml_diff>

<commit_message>
Finish until DB BR 412 ICE 4
</commit_message>
<xml_diff>
--- a/raildriver-Germany-Remapped.docx
+++ b/raildriver-Germany-Remapped.docx
@@ -48341,25 +48341,7 @@
           <w:sz w:val="16"/>
           <w:szCs w:val="16"/>
         </w:rPr>
-        <w:t xml:space="preserve">    DB BR 44</w:t>
-      </w:r>
-      <w:r>
-        <w:rPr>
-          <w:rFonts w:eastAsia="arial" w:ascii="arial" w:hAnsi="arial"/>
-          <w:color w:val="000000"/>
-          <w:sz w:val="16"/>
-          <w:szCs w:val="16"/>
-        </w:rPr>
-        <w:t>0</w:t>
-      </w:r>
-      <w:r>
-        <w:rPr>
-          <w:rFonts w:eastAsia="arial" w:ascii="arial" w:hAnsi="arial"/>
-          <w:color w:val="000000"/>
-          <w:sz w:val="16"/>
-          <w:szCs w:val="16"/>
-        </w:rPr>
-        <w:t>-1</w:t>
+        <w:t xml:space="preserve">    DB BR 440-1</w:t>
       </w:r>
     </w:p>
     <w:tbl>
@@ -48701,16 +48683,7 @@
                 <w:sz w:val="16"/>
                 <w:szCs w:val="16"/>
               </w:rPr>
-              <w:t>Reading</w:t>
-            </w:r>
-            <w:r>
-              <w:rPr>
-                <w:rFonts w:eastAsia="arial" w:ascii="arial" w:hAnsi="arial"/>
-                <w:color w:val="000000"/>
-                <w:sz w:val="16"/>
-                <w:szCs w:val="16"/>
-              </w:rPr>
-              <w:t xml:space="preserve"> Light Up</w:t>
+              <w:t>Reading Light Up</w:t>
             </w:r>
           </w:p>
         </w:tc>
@@ -48957,25 +48930,7 @@
           <w:szCs w:val="16"/>
         </w:rPr>
         <w:tab/>
-        <w:t xml:space="preserve">           DB BR 44</w:t>
-      </w:r>
-      <w:r>
-        <w:rPr>
-          <w:rFonts w:eastAsia="arial" w:ascii="arial" w:hAnsi="arial"/>
-          <w:color w:val="000000"/>
-          <w:sz w:val="16"/>
-          <w:szCs w:val="16"/>
-        </w:rPr>
-        <w:t>0</w:t>
-      </w:r>
-      <w:r>
-        <w:rPr>
-          <w:rFonts w:eastAsia="arial" w:ascii="arial" w:hAnsi="arial"/>
-          <w:color w:val="000000"/>
-          <w:sz w:val="16"/>
-          <w:szCs w:val="16"/>
-        </w:rPr>
-        <w:t>-2</w:t>
+        <w:t xml:space="preserve">           DB BR 440-2</w:t>
       </w:r>
     </w:p>
     <w:tbl>
@@ -49337,16 +49292,7 @@
                 <w:sz w:val="16"/>
                 <w:szCs w:val="16"/>
               </w:rPr>
-              <w:t>Reading</w:t>
-            </w:r>
-            <w:r>
-              <w:rPr>
-                <w:rFonts w:eastAsia="arial" w:ascii="arial" w:hAnsi="arial"/>
-                <w:color w:val="000000"/>
-                <w:sz w:val="16"/>
-                <w:szCs w:val="16"/>
-              </w:rPr>
-              <w:t xml:space="preserve"> Light Dw</w:t>
+              <w:t>Reading Light Dw</w:t>
             </w:r>
           </w:p>
         </w:tc>
@@ -49622,43 +49568,7 @@
           <w:sz w:val="16"/>
           <w:szCs w:val="16"/>
         </w:rPr>
-        <w:t xml:space="preserve">    DB BR 4</w:t>
-      </w:r>
-      <w:r>
-        <w:rPr>
-          <w:rFonts w:eastAsia="arial" w:ascii="arial" w:hAnsi="arial"/>
-          <w:color w:val="000000"/>
-          <w:sz w:val="16"/>
-          <w:szCs w:val="16"/>
-        </w:rPr>
-        <w:t>12</w:t>
-      </w:r>
-      <w:r>
-        <w:rPr>
-          <w:rFonts w:eastAsia="arial" w:ascii="arial" w:hAnsi="arial"/>
-          <w:color w:val="000000"/>
-          <w:sz w:val="16"/>
-          <w:szCs w:val="16"/>
-        </w:rPr>
-        <w:t xml:space="preserve"> ICE </w:t>
-      </w:r>
-      <w:r>
-        <w:rPr>
-          <w:rFonts w:eastAsia="arial" w:ascii="arial" w:hAnsi="arial"/>
-          <w:color w:val="000000"/>
-          <w:sz w:val="16"/>
-          <w:szCs w:val="16"/>
-        </w:rPr>
-        <w:t>4</w:t>
-      </w:r>
-      <w:r>
-        <w:rPr>
-          <w:rFonts w:eastAsia="arial" w:ascii="arial" w:hAnsi="arial"/>
-          <w:color w:val="000000"/>
-          <w:sz w:val="16"/>
-          <w:szCs w:val="16"/>
-        </w:rPr>
-        <w:t>-1</w:t>
+        <w:t xml:space="preserve">    DB BR 412 ICE 4-1</w:t>
       </w:r>
     </w:p>
     <w:tbl>
@@ -49939,7 +49849,12 @@
               </w:rPr>
             </w:pPr>
             <w:r>
-              <w:rPr/>
+              <w:rPr>
+                <w:rFonts w:eastAsia="arial" w:ascii="arial" w:hAnsi="arial"/>
+                <w:color w:val="000000"/>
+                <w:sz w:val="16"/>
+                <w:szCs w:val="16"/>
+              </w:rPr>
             </w:r>
           </w:p>
         </w:tc>
@@ -50058,16 +49973,7 @@
                 <w:sz w:val="16"/>
                 <w:szCs w:val="16"/>
               </w:rPr>
-              <w:t xml:space="preserve">Cab Light </w:t>
-            </w:r>
-            <w:r>
-              <w:rPr>
-                <w:rFonts w:eastAsia="arial" w:ascii="arial" w:hAnsi="arial"/>
-                <w:color w:val="000000"/>
-                <w:sz w:val="16"/>
-                <w:szCs w:val="16"/>
-              </w:rPr>
-              <w:t>Timetable</w:t>
+              <w:t>Cab Light Timetable</w:t>
             </w:r>
           </w:p>
         </w:tc>
@@ -50231,43 +50137,7 @@
           <w:szCs w:val="16"/>
         </w:rPr>
         <w:tab/>
-        <w:t xml:space="preserve">           DB BR 4</w:t>
-      </w:r>
-      <w:r>
-        <w:rPr>
-          <w:rFonts w:eastAsia="arial" w:ascii="arial" w:hAnsi="arial"/>
-          <w:color w:val="000000"/>
-          <w:sz w:val="16"/>
-          <w:szCs w:val="16"/>
-        </w:rPr>
-        <w:t>12</w:t>
-      </w:r>
-      <w:r>
-        <w:rPr>
-          <w:rFonts w:eastAsia="arial" w:ascii="arial" w:hAnsi="arial"/>
-          <w:color w:val="000000"/>
-          <w:sz w:val="16"/>
-          <w:szCs w:val="16"/>
-        </w:rPr>
-        <w:t xml:space="preserve"> ICE </w:t>
-      </w:r>
-      <w:r>
-        <w:rPr>
-          <w:rFonts w:eastAsia="arial" w:ascii="arial" w:hAnsi="arial"/>
-          <w:color w:val="000000"/>
-          <w:sz w:val="16"/>
-          <w:szCs w:val="16"/>
-        </w:rPr>
-        <w:t>4</w:t>
-      </w:r>
-      <w:r>
-        <w:rPr>
-          <w:rFonts w:eastAsia="arial" w:ascii="arial" w:hAnsi="arial"/>
-          <w:color w:val="000000"/>
-          <w:sz w:val="16"/>
-          <w:szCs w:val="16"/>
-        </w:rPr>
-        <w:t>-2</w:t>
+        <w:t xml:space="preserve">           DB BR 412 ICE 4-2</w:t>
       </w:r>
     </w:p>
     <w:tbl>
@@ -50673,16 +50543,7 @@
                 <w:sz w:val="16"/>
                 <w:szCs w:val="16"/>
               </w:rPr>
-              <w:t xml:space="preserve">Cab Light </w:t>
-            </w:r>
-            <w:r>
-              <w:rPr>
-                <w:rFonts w:eastAsia="arial" w:ascii="arial" w:hAnsi="arial"/>
-                <w:color w:val="000000"/>
-                <w:sz w:val="16"/>
-                <w:szCs w:val="16"/>
-              </w:rPr>
-              <w:t>Cab</w:t>
+              <w:t>Cab Light Cab</w:t>
             </w:r>
           </w:p>
         </w:tc>
@@ -51871,13 +51732,13 @@
       <w:rFonts w:ascii="Symbol" w:hAnsi="Symbol" w:cs="Symbol"/>
     </w:rPr>
   </w:style>
-  <w:style w:type="character" w:styleId="user" w:customStyle="1">
-    <w:name w:val="번호 매기기 기호 (user)"/>
+  <w:style w:type="character" w:styleId="Style5" w:customStyle="1">
+    <w:name w:val="번호 매기기 기호"/>
     <w:qFormat/>
     <w:rPr/>
   </w:style>
-  <w:style w:type="character" w:styleId="Style5">
-    <w:name w:val="번호 매기기 기호"/>
+  <w:style w:type="character" w:styleId="user">
+    <w:name w:val="번호 매기기 기호 (user)"/>
     <w:qFormat/>
     <w:rPr/>
   </w:style>
@@ -51891,7 +51752,7 @@
       <w:spacing w:before="240" w:after="120"/>
     </w:pPr>
     <w:rPr>
-      <w:rFonts w:ascii="Liberation Sans" w:hAnsi="Liberation Sans" w:eastAsia="Noto Sans CJK KR" w:cs="Lohit Devanagari"/>
+      <w:rFonts w:ascii="Liberation Sans" w:hAnsi="Liberation Sans" w:eastAsia="Noto Sans KR" w:cs="Arial"/>
       <w:sz w:val="28"/>
       <w:szCs w:val="28"/>
     </w:rPr>
@@ -51928,7 +51789,7 @@
       <w:szCs w:val="24"/>
     </w:rPr>
   </w:style>
-  <w:style w:type="paragraph" w:styleId="Style7" w:customStyle="1">
+  <w:style w:type="paragraph" w:styleId="Style7">
     <w:name w:val="색인"/>
     <w:basedOn w:val="Normal"/>
     <w:qFormat/>
@@ -51936,7 +51797,8 @@
       <w:suppressLineNumbers/>
     </w:pPr>
     <w:rPr>
-      <w:rFonts w:cs="Lohit Devanagari"/>
+      <w:rFonts w:cs="Arial"/>
+      <w:sz w:val="24"/>
     </w:rPr>
   </w:style>
   <w:style w:type="paragraph" w:styleId="user1">
@@ -51949,12 +51811,12 @@
       <w:spacing w:before="240" w:after="120"/>
     </w:pPr>
     <w:rPr>
-      <w:rFonts w:ascii="Liberation Sans" w:hAnsi="Liberation Sans" w:eastAsia="Noto Sans KR" w:cs="Arial"/>
+      <w:rFonts w:ascii="Liberation Sans" w:hAnsi="Liberation Sans" w:eastAsia="Noto Sans CJK KR" w:cs="Lohit Devanagari"/>
       <w:sz w:val="28"/>
       <w:szCs w:val="28"/>
     </w:rPr>
   </w:style>
-  <w:style w:type="paragraph" w:styleId="user2">
+  <w:style w:type="paragraph" w:styleId="user2" w:customStyle="1">
     <w:name w:val="색인 (user)"/>
     <w:basedOn w:val="Normal"/>
     <w:qFormat/>
@@ -51962,8 +51824,7 @@
       <w:suppressLineNumbers/>
     </w:pPr>
     <w:rPr>
-      <w:rFonts w:cs="Arial"/>
-      <w:sz w:val="24"/>
+      <w:rFonts w:cs="Lohit Devanagari"/>
     </w:rPr>
   </w:style>
   <w:style w:type="paragraph" w:styleId="Title">
@@ -52645,8 +52506,8 @@
       <w:szCs w:val="24"/>
     </w:rPr>
   </w:style>
-  <w:style w:type="paragraph" w:styleId="Style8" w:customStyle="1">
-    <w:name w:val="표 내용"/>
+  <w:style w:type="paragraph" w:styleId="user3" w:customStyle="1">
+    <w:name w:val="표 내용 (user)"/>
     <w:basedOn w:val="Normal"/>
     <w:qFormat/>
     <w:pPr>
@@ -52654,9 +52515,9 @@
     </w:pPr>
     <w:rPr/>
   </w:style>
-  <w:style w:type="paragraph" w:styleId="Style9" w:customStyle="1">
-    <w:name w:val="표제목"/>
-    <w:basedOn w:val="Style8"/>
+  <w:style w:type="paragraph" w:styleId="user4" w:customStyle="1">
+    <w:name w:val="표제목 (user)"/>
+    <w:basedOn w:val="user3"/>
     <w:qFormat/>
     <w:pPr>
       <w:jc w:val="center"/>
@@ -52666,8 +52527,8 @@
       <w:bCs/>
     </w:rPr>
   </w:style>
-  <w:style w:type="paragraph" w:styleId="user3">
-    <w:name w:val="표 내용 (user)"/>
+  <w:style w:type="paragraph" w:styleId="Style8">
+    <w:name w:val="표 내용"/>
     <w:basedOn w:val="Normal"/>
     <w:qFormat/>
     <w:pPr>
@@ -52676,9 +52537,9 @@
     </w:pPr>
     <w:rPr/>
   </w:style>
-  <w:style w:type="paragraph" w:styleId="user4">
-    <w:name w:val="표제목 (user)"/>
-    <w:basedOn w:val="user3"/>
+  <w:style w:type="paragraph" w:styleId="Style9">
+    <w:name w:val="표제목"/>
+    <w:basedOn w:val="Style8"/>
     <w:qFormat/>
     <w:pPr>
       <w:suppressLineNumbers/>

</xml_diff>